<commit_message>
feat: se agregó validacion de confirmaión en backend y forntend, falta mejorar los estilos de los modales y botones
</commit_message>
<xml_diff>
--- a/Procedimiento para backend.docx
+++ b/Procedimiento para backend.docx
@@ -3346,9 +3346,1044 @@
         </w:rPr>
         <w:t>cors</w:t>
       </w:r>
+      <w:proofErr w:type="spellEnd"/>
+    </w:p>
+    <w:p>
+      <w:pPr>
+        <w:rPr>
+          <w:lang w:val="en-US" w:eastAsia="en-US"/>
+        </w:rPr>
+      </w:pPr>
+    </w:p>
+    <w:p>
+      <w:pPr>
+        <w:spacing w:before="0" w:after="0" w:line="240" w:lineRule="auto"/>
+        <w:rPr>
+          <w:rFonts w:cs="Arial"/>
+          <w:b/>
+          <w:color w:val="39A900"/>
+          <w:sz w:val="32"/>
+          <w:szCs w:val="36"/>
+          <w:lang w:val="en-US" w:eastAsia="en-US"/>
+        </w:rPr>
+      </w:pPr>
+      <w:r>
+        <w:rPr>
+          <w:lang w:val="en-US"/>
+        </w:rPr>
+        <w:br w:type="page"/>
+      </w:r>
+    </w:p>
+    <w:p>
+      <w:pPr>
+        <w:pStyle w:val="2PTtulondices"/>
+        <w:rPr>
+          <w:lang w:val="en-US"/>
+        </w:rPr>
+      </w:pPr>
+      <w:proofErr w:type="spellStart"/>
+      <w:r>
+        <w:rPr>
+          <w:lang w:val="en-US"/>
+        </w:rPr>
+        <w:lastRenderedPageBreak/>
+        <w:t>Objetivo</w:t>
+      </w:r>
+      <w:proofErr w:type="spellEnd"/>
+      <w:r>
+        <w:rPr>
+          <w:lang w:val="en-US"/>
+        </w:rPr>
+        <w:t xml:space="preserve"> de las </w:t>
+      </w:r>
+      <w:proofErr w:type="spellStart"/>
+      <w:r>
+        <w:rPr>
+          <w:lang w:val="en-US"/>
+        </w:rPr>
+        <w:t>Tablas</w:t>
+      </w:r>
+      <w:proofErr w:type="spellEnd"/>
+    </w:p>
+    <w:p>
+      <w:pPr>
+        <w:pStyle w:val="Ttulo1"/>
+        <w:rPr>
+          <w:lang w:eastAsia="en-US"/>
+        </w:rPr>
+      </w:pPr>
+      <w:r>
+        <w:rPr>
+          <w:lang w:eastAsia="en-US"/>
+        </w:rPr>
+        <w:t xml:space="preserve">Tabla: </w:t>
+      </w:r>
+      <w:proofErr w:type="spellStart"/>
+      <w:r>
+        <w:rPr>
+          <w:lang w:eastAsia="en-US"/>
+        </w:rPr>
+        <w:t>invitations</w:t>
+      </w:r>
+      <w:proofErr w:type="spellEnd"/>
+    </w:p>
+    <w:p>
+      <w:pPr>
+        <w:rPr>
+          <w:lang w:eastAsia="en-US"/>
+        </w:rPr>
+      </w:pPr>
+      <w:r>
+        <w:rPr>
+          <w:lang w:eastAsia="en-US"/>
+        </w:rPr>
+        <w:t>Representa UNA invitación enviada por el anfitrión</w:t>
+      </w:r>
+    </w:p>
+    <w:p>
+      <w:pPr>
+        <w:rPr>
+          <w:lang w:eastAsia="en-US"/>
+        </w:rPr>
+      </w:pPr>
+      <w:r>
+        <w:rPr>
+          <w:lang w:eastAsia="en-US"/>
+        </w:rPr>
+        <w:t>Ejemplo:</w:t>
+      </w:r>
+    </w:p>
+    <w:tbl>
+      <w:tblPr>
+        <w:tblW w:w="0" w:type="auto"/>
+        <w:tblCellSpacing w:w="15" w:type="dxa"/>
+        <w:tblCellMar>
+          <w:top w:w="15" w:type="dxa"/>
+          <w:left w:w="15" w:type="dxa"/>
+          <w:bottom w:w="15" w:type="dxa"/>
+          <w:right w:w="15" w:type="dxa"/>
+        </w:tblCellMar>
+        <w:tblLook w:val="04A0" w:firstRow="1" w:lastRow="0" w:firstColumn="1" w:lastColumn="0" w:noHBand="0" w:noVBand="1"/>
+      </w:tblPr>
+      <w:tblGrid>
+        <w:gridCol w:w="863"/>
+        <w:gridCol w:w="2170"/>
+      </w:tblGrid>
+      <w:tr>
+        <w:trPr>
+          <w:tblHeader/>
+          <w:tblCellSpacing w:w="15" w:type="dxa"/>
+        </w:trPr>
+        <w:tc>
+          <w:tcPr>
+            <w:tcW w:w="0" w:type="auto"/>
+            <w:vAlign w:val="center"/>
+            <w:hideMark/>
+          </w:tcPr>
+          <w:p>
+            <w:pPr>
+              <w:rPr>
+                <w:b/>
+                <w:bCs/>
+                <w:lang w:eastAsia="en-US"/>
+              </w:rPr>
+            </w:pPr>
+            <w:proofErr w:type="spellStart"/>
+            <w:r>
+              <w:rPr>
+                <w:b/>
+                <w:bCs/>
+                <w:lang w:eastAsia="en-US"/>
+              </w:rPr>
+              <w:t>token</w:t>
+            </w:r>
+            <w:proofErr w:type="spellEnd"/>
+          </w:p>
+        </w:tc>
+        <w:tc>
+          <w:tcPr>
+            <w:tcW w:w="0" w:type="auto"/>
+            <w:vAlign w:val="center"/>
+            <w:hideMark/>
+          </w:tcPr>
+          <w:p>
+            <w:pPr>
+              <w:rPr>
+                <w:b/>
+                <w:bCs/>
+                <w:lang w:eastAsia="en-US"/>
+              </w:rPr>
+            </w:pPr>
+            <w:proofErr w:type="spellStart"/>
+            <w:r>
+              <w:rPr>
+                <w:b/>
+                <w:bCs/>
+                <w:lang w:eastAsia="en-US"/>
+              </w:rPr>
+              <w:t>main_guest_name</w:t>
+            </w:r>
+            <w:proofErr w:type="spellEnd"/>
+          </w:p>
+        </w:tc>
+      </w:tr>
+      <w:tr>
+        <w:trPr>
+          <w:tblCellSpacing w:w="15" w:type="dxa"/>
+        </w:trPr>
+        <w:tc>
+          <w:tcPr>
+            <w:tcW w:w="0" w:type="auto"/>
+            <w:vAlign w:val="center"/>
+            <w:hideMark/>
+          </w:tcPr>
+          <w:p>
+            <w:pPr>
+              <w:rPr>
+                <w:lang w:eastAsia="en-US"/>
+              </w:rPr>
+            </w:pPr>
+            <w:r>
+              <w:rPr>
+                <w:lang w:eastAsia="en-US"/>
+              </w:rPr>
+              <w:t>abc123</w:t>
+            </w:r>
+          </w:p>
+        </w:tc>
+        <w:tc>
+          <w:tcPr>
+            <w:tcW w:w="0" w:type="auto"/>
+            <w:vAlign w:val="center"/>
+            <w:hideMark/>
+          </w:tcPr>
+          <w:p>
+            <w:pPr>
+              <w:rPr>
+                <w:lang w:eastAsia="en-US"/>
+              </w:rPr>
+            </w:pPr>
+            <w:r>
+              <w:rPr>
+                <w:lang w:eastAsia="en-US"/>
+              </w:rPr>
+              <w:t>Edwar Velásquez</w:t>
+            </w:r>
+          </w:p>
+        </w:tc>
+      </w:tr>
+    </w:tbl>
+    <w:p>
+      <w:pPr>
+        <w:rPr>
+          <w:lang w:eastAsia="en-US"/>
+        </w:rPr>
+      </w:pPr>
+      <w:r>
+        <w:rPr>
+          <w:rFonts w:ascii="Segoe UI Symbol" w:hAnsi="Segoe UI Symbol" w:cs="Segoe UI Symbol"/>
+          <w:lang w:eastAsia="en-US"/>
+        </w:rPr>
+        <w:t>👉</w:t>
+      </w:r>
+      <w:r>
+        <w:rPr>
+          <w:lang w:eastAsia="en-US"/>
+        </w:rPr>
+        <w:t xml:space="preserve"> Es el </w:t>
+      </w:r>
+      <w:r>
+        <w:rPr>
+          <w:b/>
+          <w:bCs/>
+          <w:lang w:eastAsia="en-US"/>
+        </w:rPr>
+        <w:t>link único</w:t>
+      </w:r>
+      <w:r>
+        <w:rPr>
+          <w:lang w:eastAsia="en-US"/>
+        </w:rPr>
+        <w:t xml:space="preserve"> que se envía por WhatsApp</w:t>
+      </w:r>
+    </w:p>
+    <w:p>
+      <w:pPr>
+        <w:rPr>
+          <w:lang w:eastAsia="en-US"/>
+        </w:rPr>
+      </w:pPr>
+    </w:p>
+    <w:p>
+      <w:pPr>
+        <w:pStyle w:val="Ttulo1"/>
+        <w:rPr>
+          <w:lang w:eastAsia="en-US"/>
+        </w:rPr>
+      </w:pPr>
+      <w:r>
+        <w:rPr>
+          <w:lang w:eastAsia="en-US"/>
+        </w:rPr>
+        <w:t xml:space="preserve">Tabla: </w:t>
+      </w:r>
+      <w:proofErr w:type="spellStart"/>
+      <w:r>
+        <w:rPr>
+          <w:lang w:eastAsia="en-US"/>
+        </w:rPr>
+        <w:t>guests</w:t>
+      </w:r>
+      <w:proofErr w:type="spellEnd"/>
+    </w:p>
+    <w:p>
+      <w:pPr>
+        <w:rPr>
+          <w:lang w:eastAsia="en-US"/>
+        </w:rPr>
+      </w:pPr>
+      <w:r>
+        <w:rPr>
+          <w:lang w:eastAsia="en-US"/>
+        </w:rPr>
+        <w:t>Personas incluidas dentro de UNA invitación</w:t>
+      </w:r>
+    </w:p>
+    <w:p>
+      <w:pPr>
+        <w:rPr>
+          <w:lang w:eastAsia="en-US"/>
+        </w:rPr>
+      </w:pPr>
+      <w:r>
+        <w:rPr>
+          <w:lang w:eastAsia="en-US"/>
+        </w:rPr>
+        <w:t>Ejemplo:</w:t>
+      </w:r>
+    </w:p>
+    <w:tbl>
+      <w:tblPr>
+        <w:tblW w:w="0" w:type="auto"/>
+        <w:tblCellSpacing w:w="15" w:type="dxa"/>
+        <w:tblCellMar>
+          <w:top w:w="15" w:type="dxa"/>
+          <w:left w:w="15" w:type="dxa"/>
+          <w:bottom w:w="15" w:type="dxa"/>
+          <w:right w:w="15" w:type="dxa"/>
+        </w:tblCellMar>
+        <w:tblLook w:val="04A0" w:firstRow="1" w:lastRow="0" w:firstColumn="1" w:lastColumn="0" w:noHBand="0" w:noVBand="1"/>
+      </w:tblPr>
+      <w:tblGrid>
+        <w:gridCol w:w="1489"/>
+        <w:gridCol w:w="1928"/>
+        <w:gridCol w:w="969"/>
+      </w:tblGrid>
+      <w:tr>
+        <w:trPr>
+          <w:tblHeader/>
+          <w:tblCellSpacing w:w="15" w:type="dxa"/>
+        </w:trPr>
+        <w:tc>
+          <w:tcPr>
+            <w:tcW w:w="0" w:type="auto"/>
+            <w:vAlign w:val="center"/>
+            <w:hideMark/>
+          </w:tcPr>
+          <w:p>
+            <w:pPr>
+              <w:rPr>
+                <w:b/>
+                <w:bCs/>
+                <w:lang w:eastAsia="en-US"/>
+              </w:rPr>
+            </w:pPr>
+            <w:proofErr w:type="spellStart"/>
+            <w:r>
+              <w:rPr>
+                <w:b/>
+                <w:bCs/>
+                <w:lang w:eastAsia="en-US"/>
+              </w:rPr>
+              <w:t>invitation_id</w:t>
+            </w:r>
+            <w:proofErr w:type="spellEnd"/>
+          </w:p>
+        </w:tc>
+        <w:tc>
+          <w:tcPr>
+            <w:tcW w:w="0" w:type="auto"/>
+            <w:vAlign w:val="center"/>
+            <w:hideMark/>
+          </w:tcPr>
+          <w:p>
+            <w:pPr>
+              <w:rPr>
+                <w:b/>
+                <w:bCs/>
+                <w:lang w:eastAsia="en-US"/>
+              </w:rPr>
+            </w:pPr>
+            <w:proofErr w:type="spellStart"/>
+            <w:r>
+              <w:rPr>
+                <w:b/>
+                <w:bCs/>
+                <w:lang w:eastAsia="en-US"/>
+              </w:rPr>
+              <w:t>name</w:t>
+            </w:r>
+            <w:proofErr w:type="spellEnd"/>
+          </w:p>
+        </w:tc>
+        <w:tc>
+          <w:tcPr>
+            <w:tcW w:w="0" w:type="auto"/>
+            <w:vAlign w:val="center"/>
+            <w:hideMark/>
+          </w:tcPr>
+          <w:p>
+            <w:pPr>
+              <w:rPr>
+                <w:b/>
+                <w:bCs/>
+                <w:lang w:eastAsia="en-US"/>
+              </w:rPr>
+            </w:pPr>
+            <w:proofErr w:type="spellStart"/>
+            <w:r>
+              <w:rPr>
+                <w:b/>
+                <w:bCs/>
+                <w:lang w:eastAsia="en-US"/>
+              </w:rPr>
+              <w:t>is_main</w:t>
+            </w:r>
+            <w:proofErr w:type="spellEnd"/>
+          </w:p>
+        </w:tc>
+      </w:tr>
+      <w:tr>
+        <w:trPr>
+          <w:tblCellSpacing w:w="15" w:type="dxa"/>
+        </w:trPr>
+        <w:tc>
+          <w:tcPr>
+            <w:tcW w:w="0" w:type="auto"/>
+            <w:vAlign w:val="center"/>
+            <w:hideMark/>
+          </w:tcPr>
+          <w:p>
+            <w:pPr>
+              <w:rPr>
+                <w:lang w:eastAsia="en-US"/>
+              </w:rPr>
+            </w:pPr>
+            <w:r>
+              <w:rPr>
+                <w:lang w:eastAsia="en-US"/>
+              </w:rPr>
+              <w:t>abc123</w:t>
+            </w:r>
+          </w:p>
+        </w:tc>
+        <w:tc>
+          <w:tcPr>
+            <w:tcW w:w="0" w:type="auto"/>
+            <w:vAlign w:val="center"/>
+            <w:hideMark/>
+          </w:tcPr>
+          <w:p>
+            <w:pPr>
+              <w:rPr>
+                <w:lang w:eastAsia="en-US"/>
+              </w:rPr>
+            </w:pPr>
+            <w:r>
+              <w:rPr>
+                <w:lang w:eastAsia="en-US"/>
+              </w:rPr>
+              <w:t>Edwar Velásquez</w:t>
+            </w:r>
+          </w:p>
+        </w:tc>
+        <w:tc>
+          <w:tcPr>
+            <w:tcW w:w="0" w:type="auto"/>
+            <w:vAlign w:val="center"/>
+            <w:hideMark/>
+          </w:tcPr>
+          <w:p>
+            <w:pPr>
+              <w:rPr>
+                <w:lang w:eastAsia="en-US"/>
+              </w:rPr>
+            </w:pPr>
+            <w:r>
+              <w:rPr>
+                <w:lang w:eastAsia="en-US"/>
+              </w:rPr>
+              <w:t>true</w:t>
+            </w:r>
+          </w:p>
+        </w:tc>
+      </w:tr>
+      <w:tr>
+        <w:trPr>
+          <w:tblCellSpacing w:w="15" w:type="dxa"/>
+        </w:trPr>
+        <w:tc>
+          <w:tcPr>
+            <w:tcW w:w="0" w:type="auto"/>
+            <w:vAlign w:val="center"/>
+            <w:hideMark/>
+          </w:tcPr>
+          <w:p>
+            <w:pPr>
+              <w:rPr>
+                <w:lang w:eastAsia="en-US"/>
+              </w:rPr>
+            </w:pPr>
+            <w:r>
+              <w:rPr>
+                <w:lang w:eastAsia="en-US"/>
+              </w:rPr>
+              <w:t>abc123</w:t>
+            </w:r>
+          </w:p>
+        </w:tc>
+        <w:tc>
+          <w:tcPr>
+            <w:tcW w:w="0" w:type="auto"/>
+            <w:vAlign w:val="center"/>
+            <w:hideMark/>
+          </w:tcPr>
+          <w:p>
+            <w:pPr>
+              <w:rPr>
+                <w:lang w:eastAsia="en-US"/>
+              </w:rPr>
+            </w:pPr>
+            <w:r>
+              <w:rPr>
+                <w:lang w:eastAsia="en-US"/>
+              </w:rPr>
+              <w:t>Adriana López</w:t>
+            </w:r>
+          </w:p>
+        </w:tc>
+        <w:tc>
+          <w:tcPr>
+            <w:tcW w:w="0" w:type="auto"/>
+            <w:vAlign w:val="center"/>
+            <w:hideMark/>
+          </w:tcPr>
+          <w:p>
+            <w:pPr>
+              <w:rPr>
+                <w:lang w:eastAsia="en-US"/>
+              </w:rPr>
+            </w:pPr>
+            <w:r>
+              <w:rPr>
+                <w:lang w:eastAsia="en-US"/>
+              </w:rPr>
+              <w:t>false</w:t>
+            </w:r>
+          </w:p>
+        </w:tc>
+      </w:tr>
+      <w:tr>
+        <w:trPr>
+          <w:tblCellSpacing w:w="15" w:type="dxa"/>
+        </w:trPr>
+        <w:tc>
+          <w:tcPr>
+            <w:tcW w:w="0" w:type="auto"/>
+            <w:vAlign w:val="center"/>
+            <w:hideMark/>
+          </w:tcPr>
+          <w:p>
+            <w:pPr>
+              <w:rPr>
+                <w:lang w:eastAsia="en-US"/>
+              </w:rPr>
+            </w:pPr>
+            <w:r>
+              <w:rPr>
+                <w:lang w:eastAsia="en-US"/>
+              </w:rPr>
+              <w:t>abc123</w:t>
+            </w:r>
+          </w:p>
+        </w:tc>
+        <w:tc>
+          <w:tcPr>
+            <w:tcW w:w="0" w:type="auto"/>
+            <w:vAlign w:val="center"/>
+            <w:hideMark/>
+          </w:tcPr>
+          <w:p>
+            <w:pPr>
+              <w:rPr>
+                <w:lang w:eastAsia="en-US"/>
+              </w:rPr>
+            </w:pPr>
+            <w:r>
+              <w:rPr>
+                <w:lang w:eastAsia="en-US"/>
+              </w:rPr>
+              <w:t>Juan Pérez</w:t>
+            </w:r>
+          </w:p>
+        </w:tc>
+        <w:tc>
+          <w:tcPr>
+            <w:tcW w:w="0" w:type="auto"/>
+            <w:vAlign w:val="center"/>
+            <w:hideMark/>
+          </w:tcPr>
+          <w:p>
+            <w:pPr>
+              <w:rPr>
+                <w:lang w:eastAsia="en-US"/>
+              </w:rPr>
+            </w:pPr>
+            <w:r>
+              <w:rPr>
+                <w:lang w:eastAsia="en-US"/>
+              </w:rPr>
+              <w:t>false</w:t>
+            </w:r>
+          </w:p>
+        </w:tc>
+      </w:tr>
+    </w:tbl>
+    <w:p>
+      <w:pPr>
+        <w:rPr>
+          <w:lang w:eastAsia="en-US"/>
+        </w:rPr>
+      </w:pPr>
+    </w:p>
+    <w:p>
+      <w:pPr>
+        <w:pStyle w:val="Ttulo1"/>
+        <w:rPr>
+          <w:lang w:eastAsia="en-US"/>
+        </w:rPr>
+      </w:pPr>
+      <w:r>
+        <w:rPr>
+          <w:lang w:eastAsia="en-US"/>
+        </w:rPr>
+        <w:t xml:space="preserve">Tabla: </w:t>
+      </w:r>
+      <w:proofErr w:type="spellStart"/>
+      <w:r>
+        <w:rPr>
+          <w:lang w:eastAsia="en-US"/>
+        </w:rPr>
+        <w:t>attendance</w:t>
+      </w:r>
+      <w:proofErr w:type="spellEnd"/>
+    </w:p>
+    <w:p>
+      <w:pPr>
+        <w:rPr>
+          <w:lang w:eastAsia="en-US"/>
+        </w:rPr>
+      </w:pPr>
+      <w:r>
+        <w:rPr>
+          <w:lang w:eastAsia="en-US"/>
+        </w:rPr>
+        <w:t>Respuesta de asistencia de cada invitado</w:t>
+      </w:r>
+    </w:p>
+    <w:p>
+      <w:pPr>
+        <w:rPr>
+          <w:lang w:eastAsia="en-US"/>
+        </w:rPr>
+      </w:pPr>
+      <w:r>
+        <w:rPr>
+          <w:lang w:eastAsia="en-US"/>
+        </w:rPr>
+        <w:t>Ejemplo:</w:t>
+      </w:r>
+    </w:p>
+    <w:tbl>
+      <w:tblPr>
+        <w:tblW w:w="0" w:type="auto"/>
+        <w:tblCellSpacing w:w="15" w:type="dxa"/>
+        <w:tblCellMar>
+          <w:top w:w="15" w:type="dxa"/>
+          <w:left w:w="15" w:type="dxa"/>
+          <w:bottom w:w="15" w:type="dxa"/>
+          <w:right w:w="15" w:type="dxa"/>
+        </w:tblCellMar>
+        <w:tblLook w:val="04A0" w:firstRow="1" w:lastRow="0" w:firstColumn="1" w:lastColumn="0" w:noHBand="0" w:noVBand="1"/>
+      </w:tblPr>
+      <w:tblGrid>
+        <w:gridCol w:w="1062"/>
+        <w:gridCol w:w="1140"/>
+        <w:gridCol w:w="1943"/>
+      </w:tblGrid>
+      <w:tr>
+        <w:trPr>
+          <w:tblHeader/>
+          <w:tblCellSpacing w:w="15" w:type="dxa"/>
+        </w:trPr>
+        <w:tc>
+          <w:tcPr>
+            <w:tcW w:w="0" w:type="auto"/>
+            <w:vAlign w:val="center"/>
+            <w:hideMark/>
+          </w:tcPr>
+          <w:p>
+            <w:pPr>
+              <w:rPr>
+                <w:b/>
+                <w:bCs/>
+                <w:lang w:eastAsia="en-US"/>
+              </w:rPr>
+            </w:pPr>
+            <w:proofErr w:type="spellStart"/>
+            <w:r>
+              <w:rPr>
+                <w:b/>
+                <w:bCs/>
+                <w:lang w:eastAsia="en-US"/>
+              </w:rPr>
+              <w:t>guest_id</w:t>
+            </w:r>
+            <w:proofErr w:type="spellEnd"/>
+          </w:p>
+        </w:tc>
+        <w:tc>
+          <w:tcPr>
+            <w:tcW w:w="0" w:type="auto"/>
+            <w:vAlign w:val="center"/>
+            <w:hideMark/>
+          </w:tcPr>
+          <w:p>
+            <w:pPr>
+              <w:rPr>
+                <w:b/>
+                <w:bCs/>
+                <w:lang w:eastAsia="en-US"/>
+              </w:rPr>
+            </w:pPr>
+            <w:proofErr w:type="spellStart"/>
+            <w:r>
+              <w:rPr>
+                <w:b/>
+                <w:bCs/>
+                <w:lang w:eastAsia="en-US"/>
+              </w:rPr>
+              <w:t>attending</w:t>
+            </w:r>
+            <w:proofErr w:type="spellEnd"/>
+          </w:p>
+        </w:tc>
+        <w:tc>
+          <w:tcPr>
+            <w:tcW w:w="0" w:type="auto"/>
+            <w:vAlign w:val="center"/>
+            <w:hideMark/>
+          </w:tcPr>
+          <w:p>
+            <w:pPr>
+              <w:rPr>
+                <w:b/>
+                <w:bCs/>
+                <w:lang w:eastAsia="en-US"/>
+              </w:rPr>
+            </w:pPr>
+            <w:proofErr w:type="spellStart"/>
+            <w:r>
+              <w:rPr>
+                <w:b/>
+                <w:bCs/>
+                <w:lang w:eastAsia="en-US"/>
+              </w:rPr>
+              <w:t>confirmed_by</w:t>
+            </w:r>
+            <w:proofErr w:type="spellEnd"/>
+          </w:p>
+        </w:tc>
+      </w:tr>
+      <w:tr>
+        <w:trPr>
+          <w:tblCellSpacing w:w="15" w:type="dxa"/>
+        </w:trPr>
+        <w:tc>
+          <w:tcPr>
+            <w:tcW w:w="0" w:type="auto"/>
+            <w:vAlign w:val="center"/>
+            <w:hideMark/>
+          </w:tcPr>
+          <w:p>
+            <w:pPr>
+              <w:rPr>
+                <w:lang w:eastAsia="en-US"/>
+              </w:rPr>
+            </w:pPr>
+            <w:r>
+              <w:rPr>
+                <w:lang w:eastAsia="en-US"/>
+              </w:rPr>
+              <w:t>Edwar</w:t>
+            </w:r>
+          </w:p>
+        </w:tc>
+        <w:tc>
+          <w:tcPr>
+            <w:tcW w:w="0" w:type="auto"/>
+            <w:vAlign w:val="center"/>
+            <w:hideMark/>
+          </w:tcPr>
+          <w:p>
+            <w:pPr>
+              <w:rPr>
+                <w:lang w:eastAsia="en-US"/>
+              </w:rPr>
+            </w:pPr>
+            <w:r>
+              <w:rPr>
+                <w:lang w:eastAsia="en-US"/>
+              </w:rPr>
+              <w:t>true</w:t>
+            </w:r>
+          </w:p>
+        </w:tc>
+        <w:tc>
+          <w:tcPr>
+            <w:tcW w:w="0" w:type="auto"/>
+            <w:vAlign w:val="center"/>
+            <w:hideMark/>
+          </w:tcPr>
+          <w:p>
+            <w:pPr>
+              <w:rPr>
+                <w:lang w:eastAsia="en-US"/>
+              </w:rPr>
+            </w:pPr>
+            <w:r>
+              <w:rPr>
+                <w:lang w:eastAsia="en-US"/>
+              </w:rPr>
+              <w:t>Edwar Velásquez</w:t>
+            </w:r>
+          </w:p>
+        </w:tc>
+      </w:tr>
+      <w:tr>
+        <w:trPr>
+          <w:tblCellSpacing w:w="15" w:type="dxa"/>
+        </w:trPr>
+        <w:tc>
+          <w:tcPr>
+            <w:tcW w:w="0" w:type="auto"/>
+            <w:vAlign w:val="center"/>
+            <w:hideMark/>
+          </w:tcPr>
+          <w:p>
+            <w:pPr>
+              <w:rPr>
+                <w:lang w:eastAsia="en-US"/>
+              </w:rPr>
+            </w:pPr>
+            <w:r>
+              <w:rPr>
+                <w:lang w:eastAsia="en-US"/>
+              </w:rPr>
+              <w:t>Adriana</w:t>
+            </w:r>
+          </w:p>
+        </w:tc>
+        <w:tc>
+          <w:tcPr>
+            <w:tcW w:w="0" w:type="auto"/>
+            <w:vAlign w:val="center"/>
+            <w:hideMark/>
+          </w:tcPr>
+          <w:p>
+            <w:pPr>
+              <w:rPr>
+                <w:lang w:eastAsia="en-US"/>
+              </w:rPr>
+            </w:pPr>
+            <w:r>
+              <w:rPr>
+                <w:lang w:eastAsia="en-US"/>
+              </w:rPr>
+              <w:t>true</w:t>
+            </w:r>
+          </w:p>
+        </w:tc>
+        <w:tc>
+          <w:tcPr>
+            <w:tcW w:w="0" w:type="auto"/>
+            <w:vAlign w:val="center"/>
+            <w:hideMark/>
+          </w:tcPr>
+          <w:p>
+            <w:pPr>
+              <w:rPr>
+                <w:lang w:eastAsia="en-US"/>
+              </w:rPr>
+            </w:pPr>
+            <w:r>
+              <w:rPr>
+                <w:lang w:eastAsia="en-US"/>
+              </w:rPr>
+              <w:t>Edwar Velásquez</w:t>
+            </w:r>
+          </w:p>
+        </w:tc>
+      </w:tr>
+      <w:tr>
+        <w:trPr>
+          <w:tblCellSpacing w:w="15" w:type="dxa"/>
+        </w:trPr>
+        <w:tc>
+          <w:tcPr>
+            <w:tcW w:w="0" w:type="auto"/>
+            <w:vAlign w:val="center"/>
+            <w:hideMark/>
+          </w:tcPr>
+          <w:p>
+            <w:pPr>
+              <w:rPr>
+                <w:lang w:eastAsia="en-US"/>
+              </w:rPr>
+            </w:pPr>
+            <w:r>
+              <w:rPr>
+                <w:lang w:eastAsia="en-US"/>
+              </w:rPr>
+              <w:lastRenderedPageBreak/>
+              <w:t>Juan</w:t>
+            </w:r>
+          </w:p>
+        </w:tc>
+        <w:tc>
+          <w:tcPr>
+            <w:tcW w:w="0" w:type="auto"/>
+            <w:vAlign w:val="center"/>
+            <w:hideMark/>
+          </w:tcPr>
+          <w:p>
+            <w:pPr>
+              <w:rPr>
+                <w:lang w:eastAsia="en-US"/>
+              </w:rPr>
+            </w:pPr>
+            <w:r>
+              <w:rPr>
+                <w:lang w:eastAsia="en-US"/>
+              </w:rPr>
+              <w:t>false</w:t>
+            </w:r>
+          </w:p>
+        </w:tc>
+        <w:tc>
+          <w:tcPr>
+            <w:tcW w:w="0" w:type="auto"/>
+            <w:vAlign w:val="center"/>
+            <w:hideMark/>
+          </w:tcPr>
+          <w:p>
+            <w:pPr>
+              <w:rPr>
+                <w:lang w:eastAsia="en-US"/>
+              </w:rPr>
+            </w:pPr>
+            <w:r>
+              <w:rPr>
+                <w:lang w:eastAsia="en-US"/>
+              </w:rPr>
+              <w:t>Edwar Velásquez</w:t>
+            </w:r>
+          </w:p>
+        </w:tc>
+      </w:tr>
+    </w:tbl>
+    <w:p>
+      <w:pPr>
+        <w:rPr>
+          <w:lang w:eastAsia="en-US"/>
+        </w:rPr>
+      </w:pPr>
       <w:bookmarkStart w:id="0" w:name="_GoBack"/>
       <w:bookmarkEnd w:id="0"/>
-      <w:proofErr w:type="spellEnd"/>
+      <w:r>
+        <w:rPr>
+          <w:lang w:eastAsia="en-US"/>
+        </w:rPr>
+        <w:t>Aquí se guarda:</w:t>
+      </w:r>
+    </w:p>
+    <w:p>
+      <w:pPr>
+        <w:numPr>
+          <w:ilvl w:val="0"/>
+          <w:numId w:val="36"/>
+        </w:numPr>
+        <w:rPr>
+          <w:lang w:eastAsia="en-US"/>
+        </w:rPr>
+      </w:pPr>
+      <w:r>
+        <w:rPr>
+          <w:lang w:eastAsia="en-US"/>
+        </w:rPr>
+        <w:t xml:space="preserve">Quién va </w:t>
+      </w:r>
+    </w:p>
+    <w:p>
+      <w:pPr>
+        <w:numPr>
+          <w:ilvl w:val="0"/>
+          <w:numId w:val="36"/>
+        </w:numPr>
+        <w:rPr>
+          <w:lang w:eastAsia="en-US"/>
+        </w:rPr>
+      </w:pPr>
+      <w:r>
+        <w:rPr>
+          <w:lang w:eastAsia="en-US"/>
+        </w:rPr>
+        <w:t xml:space="preserve">Quién no </w:t>
+      </w:r>
+    </w:p>
+    <w:p>
+      <w:pPr>
+        <w:numPr>
+          <w:ilvl w:val="0"/>
+          <w:numId w:val="36"/>
+        </w:numPr>
+        <w:rPr>
+          <w:lang w:eastAsia="en-US"/>
+        </w:rPr>
+      </w:pPr>
+      <w:r>
+        <w:rPr>
+          <w:lang w:eastAsia="en-US"/>
+        </w:rPr>
+        <w:t xml:space="preserve">Quién confirmó </w:t>
+      </w:r>
+    </w:p>
+    <w:p>
+      <w:pPr>
+        <w:rPr>
+          <w:lang w:eastAsia="en-US"/>
+        </w:rPr>
+      </w:pPr>
     </w:p>
     <w:sectPr>
       <w:headerReference w:type="default" r:id="rId11"/>
@@ -3411,40 +4446,19 @@
       </w:rPr>
       <w:t xml:space="preserve">CC BY 4.0 </w:t>
     </w:r>
-    <w:r>
-      <w:fldChar w:fldCharType="begin"/>
-    </w:r>
-    <w:r>
-      <w:rPr>
-        <w:lang w:val="en-US"/>
-      </w:rPr>
-      <w:instrText xml:space="preserve"> HYPERLINK "https://creativecommons.org/licenses/by/4.0/" </w:instrText>
-    </w:r>
-    <w:r>
-      <w:fldChar w:fldCharType="separate"/>
-    </w:r>
-    <w:r>
-      <w:rPr>
-        <w:rStyle w:val="Hipervnculo"/>
-        <w:b/>
-        <w:bCs/>
-        <w:sz w:val="18"/>
-        <w:szCs w:val="18"/>
-        <w:lang w:val="en-US"/>
-      </w:rPr>
-      <w:t>https://creativecommons.org/licenses/by/4.0/</w:t>
-    </w:r>
-    <w:r>
-      <w:rPr>
-        <w:rStyle w:val="Hipervnculo"/>
-        <w:b/>
-        <w:bCs/>
-        <w:sz w:val="18"/>
-        <w:szCs w:val="18"/>
-        <w:lang w:val="en-US"/>
-      </w:rPr>
-      <w:fldChar w:fldCharType="end"/>
-    </w:r>
+    <w:hyperlink r:id="rId1" w:history="1">
+      <w:r>
+        <w:rPr>
+          <w:rStyle w:val="Hipervnculo"/>
+          <w:b/>
+          <w:bCs/>
+          <w:sz w:val="18"/>
+          <w:szCs w:val="18"/>
+          <w:lang w:val="en-US"/>
+        </w:rPr>
+        <w:t>https://creativecommons.org/licenses/by/4.0/</w:t>
+      </w:r>
+    </w:hyperlink>
   </w:p>
 </w:ftr>
 </file>
@@ -4653,6 +5667,155 @@
     </w:lvl>
   </w:abstractNum>
   <w:abstractNum w:abstractNumId="11" w15:restartNumberingAfterBreak="0">
+    <w:nsid w:val="17391AB8"/>
+    <w:multiLevelType w:val="multilevel"/>
+    <w:tmpl w:val="8AC2C782"/>
+    <w:lvl w:ilvl="0">
+      <w:start w:val="1"/>
+      <w:numFmt w:val="bullet"/>
+      <w:lvlText w:val=""/>
+      <w:lvlJc w:val="left"/>
+      <w:pPr>
+        <w:tabs>
+          <w:tab w:val="num" w:pos="720"/>
+        </w:tabs>
+        <w:ind w:left="720" w:hanging="360"/>
+      </w:pPr>
+      <w:rPr>
+        <w:rFonts w:ascii="Symbol" w:hAnsi="Symbol" w:hint="default"/>
+        <w:sz w:val="20"/>
+      </w:rPr>
+    </w:lvl>
+    <w:lvl w:ilvl="1" w:tentative="1">
+      <w:start w:val="1"/>
+      <w:numFmt w:val="bullet"/>
+      <w:lvlText w:val="o"/>
+      <w:lvlJc w:val="left"/>
+      <w:pPr>
+        <w:tabs>
+          <w:tab w:val="num" w:pos="1440"/>
+        </w:tabs>
+        <w:ind w:left="1440" w:hanging="360"/>
+      </w:pPr>
+      <w:rPr>
+        <w:rFonts w:ascii="Courier New" w:hAnsi="Courier New" w:hint="default"/>
+        <w:sz w:val="20"/>
+      </w:rPr>
+    </w:lvl>
+    <w:lvl w:ilvl="2" w:tentative="1">
+      <w:start w:val="1"/>
+      <w:numFmt w:val="bullet"/>
+      <w:lvlText w:val=""/>
+      <w:lvlJc w:val="left"/>
+      <w:pPr>
+        <w:tabs>
+          <w:tab w:val="num" w:pos="2160"/>
+        </w:tabs>
+        <w:ind w:left="2160" w:hanging="360"/>
+      </w:pPr>
+      <w:rPr>
+        <w:rFonts w:ascii="Wingdings" w:hAnsi="Wingdings" w:hint="default"/>
+        <w:sz w:val="20"/>
+      </w:rPr>
+    </w:lvl>
+    <w:lvl w:ilvl="3" w:tentative="1">
+      <w:start w:val="1"/>
+      <w:numFmt w:val="bullet"/>
+      <w:lvlText w:val=""/>
+      <w:lvlJc w:val="left"/>
+      <w:pPr>
+        <w:tabs>
+          <w:tab w:val="num" w:pos="2880"/>
+        </w:tabs>
+        <w:ind w:left="2880" w:hanging="360"/>
+      </w:pPr>
+      <w:rPr>
+        <w:rFonts w:ascii="Wingdings" w:hAnsi="Wingdings" w:hint="default"/>
+        <w:sz w:val="20"/>
+      </w:rPr>
+    </w:lvl>
+    <w:lvl w:ilvl="4" w:tentative="1">
+      <w:start w:val="1"/>
+      <w:numFmt w:val="bullet"/>
+      <w:lvlText w:val=""/>
+      <w:lvlJc w:val="left"/>
+      <w:pPr>
+        <w:tabs>
+          <w:tab w:val="num" w:pos="3600"/>
+        </w:tabs>
+        <w:ind w:left="3600" w:hanging="360"/>
+      </w:pPr>
+      <w:rPr>
+        <w:rFonts w:ascii="Wingdings" w:hAnsi="Wingdings" w:hint="default"/>
+        <w:sz w:val="20"/>
+      </w:rPr>
+    </w:lvl>
+    <w:lvl w:ilvl="5" w:tentative="1">
+      <w:start w:val="1"/>
+      <w:numFmt w:val="bullet"/>
+      <w:lvlText w:val=""/>
+      <w:lvlJc w:val="left"/>
+      <w:pPr>
+        <w:tabs>
+          <w:tab w:val="num" w:pos="4320"/>
+        </w:tabs>
+        <w:ind w:left="4320" w:hanging="360"/>
+      </w:pPr>
+      <w:rPr>
+        <w:rFonts w:ascii="Wingdings" w:hAnsi="Wingdings" w:hint="default"/>
+        <w:sz w:val="20"/>
+      </w:rPr>
+    </w:lvl>
+    <w:lvl w:ilvl="6" w:tentative="1">
+      <w:start w:val="1"/>
+      <w:numFmt w:val="bullet"/>
+      <w:lvlText w:val=""/>
+      <w:lvlJc w:val="left"/>
+      <w:pPr>
+        <w:tabs>
+          <w:tab w:val="num" w:pos="5040"/>
+        </w:tabs>
+        <w:ind w:left="5040" w:hanging="360"/>
+      </w:pPr>
+      <w:rPr>
+        <w:rFonts w:ascii="Wingdings" w:hAnsi="Wingdings" w:hint="default"/>
+        <w:sz w:val="20"/>
+      </w:rPr>
+    </w:lvl>
+    <w:lvl w:ilvl="7" w:tentative="1">
+      <w:start w:val="1"/>
+      <w:numFmt w:val="bullet"/>
+      <w:lvlText w:val=""/>
+      <w:lvlJc w:val="left"/>
+      <w:pPr>
+        <w:tabs>
+          <w:tab w:val="num" w:pos="5760"/>
+        </w:tabs>
+        <w:ind w:left="5760" w:hanging="360"/>
+      </w:pPr>
+      <w:rPr>
+        <w:rFonts w:ascii="Wingdings" w:hAnsi="Wingdings" w:hint="default"/>
+        <w:sz w:val="20"/>
+      </w:rPr>
+    </w:lvl>
+    <w:lvl w:ilvl="8" w:tentative="1">
+      <w:start w:val="1"/>
+      <w:numFmt w:val="bullet"/>
+      <w:lvlText w:val=""/>
+      <w:lvlJc w:val="left"/>
+      <w:pPr>
+        <w:tabs>
+          <w:tab w:val="num" w:pos="6480"/>
+        </w:tabs>
+        <w:ind w:left="6480" w:hanging="360"/>
+      </w:pPr>
+      <w:rPr>
+        <w:rFonts w:ascii="Wingdings" w:hAnsi="Wingdings" w:hint="default"/>
+        <w:sz w:val="20"/>
+      </w:rPr>
+    </w:lvl>
+  </w:abstractNum>
+  <w:abstractNum w:abstractNumId="12" w15:restartNumberingAfterBreak="0">
     <w:nsid w:val="204F2F0B"/>
     <w:multiLevelType w:val="hybridMultilevel"/>
     <w:tmpl w:val="EAA4188C"/>
@@ -4738,7 +5901,7 @@
       </w:pPr>
     </w:lvl>
   </w:abstractNum>
-  <w:abstractNum w:abstractNumId="12" w15:restartNumberingAfterBreak="0">
+  <w:abstractNum w:abstractNumId="13" w15:restartNumberingAfterBreak="0">
     <w:nsid w:val="215444B1"/>
     <w:multiLevelType w:val="hybridMultilevel"/>
     <w:tmpl w:val="F586C9C2"/>
@@ -4824,7 +5987,7 @@
       </w:pPr>
     </w:lvl>
   </w:abstractNum>
-  <w:abstractNum w:abstractNumId="13" w15:restartNumberingAfterBreak="0">
+  <w:abstractNum w:abstractNumId="14" w15:restartNumberingAfterBreak="0">
     <w:nsid w:val="230705FE"/>
     <w:multiLevelType w:val="hybridMultilevel"/>
     <w:tmpl w:val="B5448514"/>
@@ -4936,7 +6099,7 @@
       </w:rPr>
     </w:lvl>
   </w:abstractNum>
-  <w:abstractNum w:abstractNumId="14" w15:restartNumberingAfterBreak="0">
+  <w:abstractNum w:abstractNumId="15" w15:restartNumberingAfterBreak="0">
     <w:nsid w:val="3520386A"/>
     <w:multiLevelType w:val="multilevel"/>
     <w:tmpl w:val="72D0393A"/>
@@ -5030,7 +6193,7 @@
       </w:pPr>
     </w:lvl>
   </w:abstractNum>
-  <w:abstractNum w:abstractNumId="15" w15:restartNumberingAfterBreak="0">
+  <w:abstractNum w:abstractNumId="16" w15:restartNumberingAfterBreak="0">
     <w:nsid w:val="39400FA6"/>
     <w:multiLevelType w:val="hybridMultilevel"/>
     <w:tmpl w:val="ADC262A8"/>
@@ -5142,7 +6305,7 @@
       </w:rPr>
     </w:lvl>
   </w:abstractNum>
-  <w:abstractNum w:abstractNumId="16" w15:restartNumberingAfterBreak="0">
+  <w:abstractNum w:abstractNumId="17" w15:restartNumberingAfterBreak="0">
     <w:nsid w:val="39FE07F3"/>
     <w:multiLevelType w:val="multilevel"/>
     <w:tmpl w:val="3A3C87B0"/>
@@ -5255,7 +6418,7 @@
       </w:rPr>
     </w:lvl>
   </w:abstractNum>
-  <w:abstractNum w:abstractNumId="17" w15:restartNumberingAfterBreak="0">
+  <w:abstractNum w:abstractNumId="18" w15:restartNumberingAfterBreak="0">
     <w:nsid w:val="40B76E27"/>
     <w:multiLevelType w:val="hybridMultilevel"/>
     <w:tmpl w:val="348094A2"/>
@@ -5341,7 +6504,7 @@
       </w:pPr>
     </w:lvl>
   </w:abstractNum>
-  <w:abstractNum w:abstractNumId="18" w15:restartNumberingAfterBreak="0">
+  <w:abstractNum w:abstractNumId="19" w15:restartNumberingAfterBreak="0">
     <w:nsid w:val="45F1027A"/>
     <w:multiLevelType w:val="multilevel"/>
     <w:tmpl w:val="46686892"/>
@@ -5490,7 +6653,7 @@
       </w:rPr>
     </w:lvl>
   </w:abstractNum>
-  <w:abstractNum w:abstractNumId="19" w15:restartNumberingAfterBreak="0">
+  <w:abstractNum w:abstractNumId="20" w15:restartNumberingAfterBreak="0">
     <w:nsid w:val="484D7BF5"/>
     <w:multiLevelType w:val="multilevel"/>
     <w:tmpl w:val="0C0A001F"/>
@@ -5576,7 +6739,7 @@
       </w:pPr>
     </w:lvl>
   </w:abstractNum>
-  <w:abstractNum w:abstractNumId="20" w15:restartNumberingAfterBreak="0">
+  <w:abstractNum w:abstractNumId="21" w15:restartNumberingAfterBreak="0">
     <w:nsid w:val="4A346511"/>
     <w:multiLevelType w:val="multilevel"/>
     <w:tmpl w:val="0C0A001F"/>
@@ -5662,7 +6825,7 @@
       </w:pPr>
     </w:lvl>
   </w:abstractNum>
-  <w:abstractNum w:abstractNumId="21" w15:restartNumberingAfterBreak="0">
+  <w:abstractNum w:abstractNumId="22" w15:restartNumberingAfterBreak="0">
     <w:nsid w:val="526C37A8"/>
     <w:multiLevelType w:val="multilevel"/>
     <w:tmpl w:val="B4F80AF4"/>
@@ -5811,7 +6974,7 @@
       </w:rPr>
     </w:lvl>
   </w:abstractNum>
-  <w:abstractNum w:abstractNumId="22" w15:restartNumberingAfterBreak="0">
+  <w:abstractNum w:abstractNumId="23" w15:restartNumberingAfterBreak="0">
     <w:nsid w:val="545F17C6"/>
     <w:multiLevelType w:val="hybridMultilevel"/>
     <w:tmpl w:val="57CEED46"/>
@@ -5897,7 +7060,7 @@
       </w:pPr>
     </w:lvl>
   </w:abstractNum>
-  <w:abstractNum w:abstractNumId="23" w15:restartNumberingAfterBreak="0">
+  <w:abstractNum w:abstractNumId="24" w15:restartNumberingAfterBreak="0">
     <w:nsid w:val="54DF44F2"/>
     <w:multiLevelType w:val="hybridMultilevel"/>
     <w:tmpl w:val="33DE1C96"/>
@@ -5986,7 +7149,7 @@
       </w:pPr>
     </w:lvl>
   </w:abstractNum>
-  <w:abstractNum w:abstractNumId="24" w15:restartNumberingAfterBreak="0">
+  <w:abstractNum w:abstractNumId="25" w15:restartNumberingAfterBreak="0">
     <w:nsid w:val="5628798C"/>
     <w:multiLevelType w:val="multilevel"/>
     <w:tmpl w:val="76FACFCE"/>
@@ -6135,7 +7298,7 @@
       </w:rPr>
     </w:lvl>
   </w:abstractNum>
-  <w:abstractNum w:abstractNumId="25" w15:restartNumberingAfterBreak="0">
+  <w:abstractNum w:abstractNumId="26" w15:restartNumberingAfterBreak="0">
     <w:nsid w:val="64851D42"/>
     <w:multiLevelType w:val="hybridMultilevel"/>
     <w:tmpl w:val="6D2A54F6"/>
@@ -6222,7 +7385,7 @@
       </w:pPr>
     </w:lvl>
   </w:abstractNum>
-  <w:abstractNum w:abstractNumId="26" w15:restartNumberingAfterBreak="0">
+  <w:abstractNum w:abstractNumId="27" w15:restartNumberingAfterBreak="0">
     <w:nsid w:val="693732B1"/>
     <w:multiLevelType w:val="multilevel"/>
     <w:tmpl w:val="393C3686"/>
@@ -6308,7 +7471,7 @@
       </w:pPr>
     </w:lvl>
   </w:abstractNum>
-  <w:abstractNum w:abstractNumId="27" w15:restartNumberingAfterBreak="0">
+  <w:abstractNum w:abstractNumId="28" w15:restartNumberingAfterBreak="0">
     <w:nsid w:val="6E946A08"/>
     <w:multiLevelType w:val="multilevel"/>
     <w:tmpl w:val="90EE6564"/>
@@ -6398,7 +7561,7 @@
       </w:pPr>
     </w:lvl>
   </w:abstractNum>
-  <w:abstractNum w:abstractNumId="28" w15:restartNumberingAfterBreak="0">
+  <w:abstractNum w:abstractNumId="29" w15:restartNumberingAfterBreak="0">
     <w:nsid w:val="6EAB6542"/>
     <w:multiLevelType w:val="hybridMultilevel"/>
     <w:tmpl w:val="E33AE3B6"/>
@@ -6484,7 +7647,7 @@
       </w:pPr>
     </w:lvl>
   </w:abstractNum>
-  <w:abstractNum w:abstractNumId="29" w15:restartNumberingAfterBreak="0">
+  <w:abstractNum w:abstractNumId="30" w15:restartNumberingAfterBreak="0">
     <w:nsid w:val="748E2F9F"/>
     <w:multiLevelType w:val="multilevel"/>
     <w:tmpl w:val="0C0A001F"/>
@@ -6570,7 +7733,7 @@
       </w:pPr>
     </w:lvl>
   </w:abstractNum>
-  <w:abstractNum w:abstractNumId="30" w15:restartNumberingAfterBreak="0">
+  <w:abstractNum w:abstractNumId="31" w15:restartNumberingAfterBreak="0">
     <w:nsid w:val="74D733C3"/>
     <w:multiLevelType w:val="hybridMultilevel"/>
     <w:tmpl w:val="E968D184"/>
@@ -6683,7 +7846,7 @@
       </w:rPr>
     </w:lvl>
   </w:abstractNum>
-  <w:abstractNum w:abstractNumId="31" w15:restartNumberingAfterBreak="0">
+  <w:abstractNum w:abstractNumId="32" w15:restartNumberingAfterBreak="0">
     <w:nsid w:val="77CA5F8A"/>
     <w:multiLevelType w:val="multilevel"/>
     <w:tmpl w:val="110A02F8"/>
@@ -6822,7 +7985,7 @@
       </w:rPr>
     </w:lvl>
   </w:abstractNum>
-  <w:abstractNum w:abstractNumId="32" w15:restartNumberingAfterBreak="0">
+  <w:abstractNum w:abstractNumId="33" w15:restartNumberingAfterBreak="0">
     <w:nsid w:val="7D4A58B6"/>
     <w:multiLevelType w:val="multilevel"/>
     <w:tmpl w:val="E0A4B08C"/>
@@ -6909,13 +8072,13 @@
     </w:lvl>
   </w:abstractNum>
   <w:num w:numId="1">
-    <w:abstractNumId w:val="12"/>
+    <w:abstractNumId w:val="13"/>
   </w:num>
   <w:num w:numId="2">
-    <w:abstractNumId w:val="28"/>
+    <w:abstractNumId w:val="29"/>
   </w:num>
   <w:num w:numId="3">
-    <w:abstractNumId w:val="17"/>
+    <w:abstractNumId w:val="18"/>
   </w:num>
   <w:num w:numId="4">
     <w:abstractNumId w:val="0"/>
@@ -6924,34 +8087,34 @@
     <w:abstractNumId w:val="5"/>
   </w:num>
   <w:num w:numId="6">
+    <w:abstractNumId w:val="21"/>
+  </w:num>
+  <w:num w:numId="7">
     <w:abstractNumId w:val="20"/>
   </w:num>
-  <w:num w:numId="7">
-    <w:abstractNumId w:val="19"/>
-  </w:num>
   <w:num w:numId="8">
-    <w:abstractNumId w:val="14"/>
+    <w:abstractNumId w:val="15"/>
   </w:num>
   <w:num w:numId="9">
-    <w:abstractNumId w:val="25"/>
+    <w:abstractNumId w:val="26"/>
   </w:num>
   <w:num w:numId="10">
+    <w:abstractNumId w:val="24"/>
+  </w:num>
+  <w:num w:numId="11">
     <w:abstractNumId w:val="23"/>
   </w:num>
-  <w:num w:numId="11">
-    <w:abstractNumId w:val="22"/>
-  </w:num>
   <w:num w:numId="12">
-    <w:abstractNumId w:val="11"/>
+    <w:abstractNumId w:val="12"/>
   </w:num>
   <w:num w:numId="13">
     <w:abstractNumId w:val="9"/>
   </w:num>
   <w:num w:numId="14">
-    <w:abstractNumId w:val="16"/>
+    <w:abstractNumId w:val="17"/>
   </w:num>
   <w:num w:numId="15">
-    <w:abstractNumId w:val="16"/>
+    <w:abstractNumId w:val="17"/>
     <w:lvlOverride w:ilvl="0">
       <w:startOverride w:val="1"/>
     </w:lvlOverride>
@@ -6963,19 +8126,19 @@
     </w:lvlOverride>
   </w:num>
   <w:num w:numId="16">
-    <w:abstractNumId w:val="16"/>
+    <w:abstractNumId w:val="17"/>
   </w:num>
   <w:num w:numId="17">
-    <w:abstractNumId w:val="29"/>
+    <w:abstractNumId w:val="30"/>
   </w:num>
   <w:num w:numId="18">
-    <w:abstractNumId w:val="27"/>
+    <w:abstractNumId w:val="28"/>
   </w:num>
   <w:num w:numId="19">
-    <w:abstractNumId w:val="32"/>
+    <w:abstractNumId w:val="33"/>
   </w:num>
   <w:num w:numId="20">
-    <w:abstractNumId w:val="26"/>
+    <w:abstractNumId w:val="27"/>
   </w:num>
   <w:num w:numId="21">
     <w:abstractNumId w:val="4"/>
@@ -6987,13 +8150,13 @@
     <w:abstractNumId w:val="3"/>
   </w:num>
   <w:num w:numId="24">
-    <w:abstractNumId w:val="24"/>
+    <w:abstractNumId w:val="25"/>
   </w:num>
   <w:num w:numId="25">
-    <w:abstractNumId w:val="21"/>
+    <w:abstractNumId w:val="22"/>
   </w:num>
   <w:num w:numId="26">
-    <w:abstractNumId w:val="18"/>
+    <w:abstractNumId w:val="19"/>
   </w:num>
   <w:num w:numId="27">
     <w:abstractNumId w:val="10"/>
@@ -7005,22 +8168,25 @@
     <w:abstractNumId w:val="6"/>
   </w:num>
   <w:num w:numId="30">
-    <w:abstractNumId w:val="15"/>
+    <w:abstractNumId w:val="16"/>
   </w:num>
   <w:num w:numId="31">
     <w:abstractNumId w:val="8"/>
   </w:num>
   <w:num w:numId="32">
-    <w:abstractNumId w:val="13"/>
+    <w:abstractNumId w:val="14"/>
   </w:num>
   <w:num w:numId="33">
-    <w:abstractNumId w:val="30"/>
+    <w:abstractNumId w:val="31"/>
   </w:num>
   <w:num w:numId="34">
     <w:abstractNumId w:val="1"/>
   </w:num>
   <w:num w:numId="35">
-    <w:abstractNumId w:val="31"/>
+    <w:abstractNumId w:val="32"/>
+  </w:num>
+  <w:num w:numId="36">
+    <w:abstractNumId w:val="11"/>
   </w:num>
 </w:numbering>
 </file>
@@ -8731,7 +9897,7 @@
 </file>
 
 <file path=customXml/itemProps1.xml><?xml version="1.0" encoding="utf-8"?>
-<ds:datastoreItem xmlns:ds="http://schemas.openxmlformats.org/officeDocument/2006/customXml" ds:itemID="{EDF55318-CFDD-40CC-B02C-37983BB3705F}">
+<ds:datastoreItem xmlns:ds="http://schemas.openxmlformats.org/officeDocument/2006/customXml" ds:itemID="{A24CE988-1ABF-4A4A-A502-C3EC9EBF5C73}">
   <ds:schemaRefs>
     <ds:schemaRef ds:uri="http://schemas.openxmlformats.org/officeDocument/2006/bibliography"/>
   </ds:schemaRefs>

</xml_diff>